<commit_message>
Australia Updates: V3 migration, entities, repositories, DTOs
</commit_message>
<xml_diff>
--- a/docs/07_Backend_Development_Log.docx
+++ b/docs/07_Backend_Development_Log.docx
@@ -920,6 +920,366 @@
                 <w:bCs w:val="false"/>
               </w:rPr>
               <w:t xml:space="preserve">Run this against the local dak_dev database (Flyway applies it automatically on next `mvn spring-boot:run`) and confirm the tables + seed roles exist, then start the Auth API (register/login) using these entities.</w:t>
+            </w:r>
+          </w:p>
+        </w:tc>
+      </w:tr>
+    </w:tbl>
+    <w:p>
+      <w:pPr>
+        <w:pStyle w:val="Heading2"/>
+      </w:pPr>
+      <w:r>
+        <w:t xml:space="preserve">Entry 5 — Auth API (register/login) implemented and verified</w:t>
+      </w:r>
+    </w:p>
+    <w:tbl>
+      <w:tblPr>
+        <w:tblW w:type="dxa" w:w="9500"/>
+        <w:tblBorders>
+          <w:top w:val="single" w:color="auto" w:sz="4"/>
+          <w:left w:val="single" w:color="auto" w:sz="4"/>
+          <w:bottom w:val="single" w:color="auto" w:sz="4"/>
+          <w:right w:val="single" w:color="auto" w:sz="4"/>
+          <w:insideH w:val="single" w:color="auto" w:sz="4"/>
+          <w:insideV w:val="single" w:color="auto" w:sz="4"/>
+        </w:tblBorders>
+      </w:tblPr>
+      <w:tblGrid>
+        <w:gridCol w:w="1800"/>
+        <w:gridCol w:w="7700"/>
+      </w:tblGrid>
+      <w:tr>
+        <w:tc>
+          <w:tcPr>
+            <w:tcW w:type="dxa" w:w="1800"/>
+            <w:shd w:fill="F2F2F2" w:color="auto" w:val="clear"/>
+          </w:tcPr>
+          <w:p>
+            <w:r>
+              <w:rPr>
+                <w:b/>
+                <w:bCs/>
+              </w:rPr>
+              <w:t xml:space="preserve">Date</w:t>
+            </w:r>
+          </w:p>
+        </w:tc>
+        <w:tc>
+          <w:tcPr>
+            <w:tcW w:type="dxa" w:w="7700"/>
+          </w:tcPr>
+          <w:p>
+            <w:r>
+              <w:rPr>
+                <w:b w:val="false"/>
+                <w:bCs w:val="false"/>
+              </w:rPr>
+              <w:t xml:space="preserve">2026-07-22</w:t>
+            </w:r>
+          </w:p>
+        </w:tc>
+      </w:tr>
+      <w:tr>
+        <w:tc>
+          <w:tcPr>
+            <w:tcW w:type="dxa" w:w="1800"/>
+            <w:shd w:fill="F2F2F2" w:color="auto" w:val="clear"/>
+          </w:tcPr>
+          <w:p>
+            <w:r>
+              <w:rPr>
+                <w:b/>
+                <w:bCs/>
+              </w:rPr>
+              <w:t xml:space="preserve">Step</w:t>
+            </w:r>
+          </w:p>
+        </w:tc>
+        <w:tc>
+          <w:tcPr>
+            <w:tcW w:type="dxa" w:w="7700"/>
+          </w:tcPr>
+          <w:p>
+            <w:r>
+              <w:rPr>
+                <w:b w:val="false"/>
+                <w:bCs w:val="false"/>
+              </w:rPr>
+              <w:t xml:space="preserve">Backend Step 3: Auth API per 05_API_Specification_DAK.docx §3.1/§3.2 (register, login).</w:t>
+            </w:r>
+          </w:p>
+        </w:tc>
+      </w:tr>
+      <w:tr>
+        <w:tc>
+          <w:tcPr>
+            <w:tcW w:type="dxa" w:w="1800"/>
+            <w:shd w:fill="F2F2F2" w:color="auto" w:val="clear"/>
+          </w:tcPr>
+          <w:p>
+            <w:r>
+              <w:rPr>
+                <w:b/>
+                <w:bCs/>
+              </w:rPr>
+              <w:t xml:space="preserve">Summary</w:t>
+            </w:r>
+          </w:p>
+        </w:tc>
+        <w:tc>
+          <w:tcPr>
+            <w:tcW w:type="dxa" w:w="7700"/>
+          </w:tcPr>
+          <w:p>
+            <w:r>
+              <w:rPr>
+                <w:b w:val="false"/>
+                <w:bCs w:val="false"/>
+              </w:rPr>
+              <w:t xml:space="preserve">Added JwtProperties + JwtService (issues HS256-signed access/refresh JWTs from app.jwt.* config), RegisterRequest/LoginRequest/AuthResponse DTOs matching the exact request/response shapes in the API spec, AuthService (registration with BCrypt password hashing, default USER role assignment, and login with the spec's constant-error-message requirement so invalid email vs invalid password are indistinguishable), and AuthController exposing POST /api/v1/auth/register and /login. SecurityConfig updated to add a PasswordEncoder bean and permit /api/v1/auth/**. Added User.createNew(...) static factory since the protected no-arg constructor (intentionally, from Entry 4) blocked `new User()` from outside the domain package. Verified via Postman: register returns 201 with user+accessToken+refreshToken; login initially failed with 500 (LazyInitializationException — User.roles is lazy-loaded and login() had no open Hibernate session since open-in-view is disabled); fixed by adding @Transactional(readOnly = true) to AuthService.login(). Both endpoints now confirmed working end-to-end against the local dak_dev database.</w:t>
+            </w:r>
+          </w:p>
+        </w:tc>
+      </w:tr>
+      <w:tr>
+        <w:tc>
+          <w:tcPr>
+            <w:tcW w:type="dxa" w:w="1800"/>
+            <w:shd w:fill="F2F2F2" w:color="auto" w:val="clear"/>
+          </w:tcPr>
+          <w:p>
+            <w:r>
+              <w:rPr>
+                <w:b/>
+                <w:bCs/>
+              </w:rPr>
+              <w:t xml:space="preserve">Files</w:t>
+            </w:r>
+          </w:p>
+        </w:tc>
+        <w:tc>
+          <w:tcPr>
+            <w:tcW w:type="dxa" w:w="7700"/>
+          </w:tcPr>
+          <w:p>
+            <w:r>
+              <w:rPr>
+                <w:b w:val="false"/>
+                <w:bCs w:val="false"/>
+              </w:rPr>
+              <w:t xml:space="preserve">config/JwtProperties.java (new); config/JwtService.java (new); dto/RegisterRequest.java (new); dto/LoginRequest.java (new); dto/AuthResponse.java (new); service/AuthService.java (new); controller/AuthController.java (new); config/SecurityConfig.java (modified); domain/User.java (modified — added createNew factory method)</w:t>
+            </w:r>
+          </w:p>
+        </w:tc>
+      </w:tr>
+      <w:tr>
+        <w:tc>
+          <w:tcPr>
+            <w:tcW w:type="dxa" w:w="1800"/>
+            <w:shd w:fill="F2F2F2" w:color="auto" w:val="clear"/>
+          </w:tcPr>
+          <w:p>
+            <w:r>
+              <w:rPr>
+                <w:b/>
+                <w:bCs/>
+              </w:rPr>
+              <w:t xml:space="preserve">Next</w:t>
+            </w:r>
+          </w:p>
+        </w:tc>
+        <w:tc>
+          <w:tcPr>
+            <w:tcW w:type="dxa" w:w="7700"/>
+          </w:tcPr>
+          <w:p>
+            <w:r>
+              <w:rPr>
+                <w:b w:val="false"/>
+                <w:bCs w:val="false"/>
+              </w:rPr>
+              <w:t xml:space="preserve">JWT authentication filter, so protected endpoints (everything except /health and /auth/**) can actually validate a Bearer token and identify the calling user. Then GET /api/v1/users/me as the first protected endpoint to prove the filter works. Known gap to revisit later: refresh tokens are self-contained JWTs, not yet revocable via a sessions table (05 API Spec §3.4 requirement).</w:t>
+            </w:r>
+          </w:p>
+        </w:tc>
+      </w:tr>
+    </w:tbl>
+    <w:p>
+      <w:pPr>
+        <w:pStyle w:val="Heading2"/>
+      </w:pPr>
+      <w:r>
+        <w:t xml:space="preserve">Entry 6 — JWT authentication filter (2단계: 검증) 완료</w:t>
+      </w:r>
+    </w:p>
+    <w:tbl>
+      <w:tblPr>
+        <w:tblW w:type="dxa" w:w="9500"/>
+        <w:tblBorders>
+          <w:top w:val="single" w:color="auto" w:sz="4"/>
+          <w:left w:val="single" w:color="auto" w:sz="4"/>
+          <w:bottom w:val="single" w:color="auto" w:sz="4"/>
+          <w:right w:val="single" w:color="auto" w:sz="4"/>
+          <w:insideH w:val="single" w:color="auto" w:sz="4"/>
+          <w:insideV w:val="single" w:color="auto" w:sz="4"/>
+        </w:tblBorders>
+      </w:tblPr>
+      <w:tblGrid>
+        <w:gridCol w:w="1800"/>
+        <w:gridCol w:w="7700"/>
+      </w:tblGrid>
+      <w:tr>
+        <w:tc>
+          <w:tcPr>
+            <w:tcW w:type="dxa" w:w="1800"/>
+            <w:shd w:fill="F2F2F2" w:color="auto" w:val="clear"/>
+          </w:tcPr>
+          <w:p>
+            <w:r>
+              <w:rPr>
+                <w:b/>
+                <w:bCs/>
+              </w:rPr>
+              <w:t xml:space="preserve">Date</w:t>
+            </w:r>
+          </w:p>
+        </w:tc>
+        <w:tc>
+          <w:tcPr>
+            <w:tcW w:type="dxa" w:w="7700"/>
+          </w:tcPr>
+          <w:p>
+            <w:r>
+              <w:rPr>
+                <w:b w:val="false"/>
+                <w:bCs w:val="false"/>
+              </w:rPr>
+              <w:t xml:space="preserve">2026-07-22</w:t>
+            </w:r>
+          </w:p>
+        </w:tc>
+      </w:tr>
+      <w:tr>
+        <w:tc>
+          <w:tcPr>
+            <w:tcW w:type="dxa" w:w="1800"/>
+            <w:shd w:fill="F2F2F2" w:color="auto" w:val="clear"/>
+          </w:tcPr>
+          <w:p>
+            <w:r>
+              <w:rPr>
+                <w:b/>
+                <w:bCs/>
+              </w:rPr>
+              <w:t xml:space="preserve">Step</w:t>
+            </w:r>
+          </w:p>
+        </w:tc>
+        <w:tc>
+          <w:tcPr>
+            <w:tcW w:type="dxa" w:w="7700"/>
+          </w:tcPr>
+          <w:p>
+            <w:r>
+              <w:rPr>
+                <w:b w:val="false"/>
+                <w:bCs w:val="false"/>
+              </w:rPr>
+              <w:t xml:space="preserve">Backend Step 4: JWT validation. Entry 5에서 발급(issue)만 있었고 검증(validate)이 없던 부분을 완성.</w:t>
+            </w:r>
+          </w:p>
+        </w:tc>
+      </w:tr>
+      <w:tr>
+        <w:tc>
+          <w:tcPr>
+            <w:tcW w:type="dxa" w:w="1800"/>
+            <w:shd w:fill="F2F2F2" w:color="auto" w:val="clear"/>
+          </w:tcPr>
+          <w:p>
+            <w:r>
+              <w:rPr>
+                <w:b/>
+                <w:bCs/>
+              </w:rPr>
+              <w:t xml:space="preserve">Summary</w:t>
+            </w:r>
+          </w:p>
+        </w:tc>
+        <w:tc>
+          <w:tcPr>
+            <w:tcW w:type="dxa" w:w="7700"/>
+          </w:tcPr>
+          <w:p>
+            <w:r>
+              <w:rPr>
+                <w:b w:val="false"/>
+                <w:bCs w:val="false"/>
+              </w:rPr>
+              <w:t xml:space="preserve">JwtAuthenticationFilter 추가 — 매 요청마다 Authorization 헤더의 Bearer 토큰을 검증하고, 유효하면 SecurityContextHolder에 인증 정보를 등록. SecurityConfig에 .addFilterBefore(...)로 등록. 첫 번째 진짜 보호된 엔드포인트로 GET /api/v1/users/me (UserController, UserProfileResponse) 추가 — @AuthenticationPrincipal User user로 필터가 등록한 인증 유저를 컨트롤러가 자동으로 받음. 겪은 오류 2건: (1) import 경로 오타 — UsernamePasswordAuthenticationFilter의 실제 패키지는 org.springframework.security.web.authentication (web 누락), mvn compile로 확인 후 수정. (2) LazyInitializationException — 필터는 @Transactional을 못 붙이는 서블릿 필터라 트랜잭션 밖에서 user.getRoles()(LAZY) 호출 시 세션 없음 에러 발생, 결과적으로 403 Forbidden(빈 body)으로 나타남. UserRepository에 @EntityGraph(attributePaths="roles")를 붙인 findWithRolesById(UUID)를 추가해 역할을 즉시 로딩하도록 해결. Postman으로 로그인→토큰 발급→/users/me 호출(200)→토큰 없이 호출(403, 보호 규칙 정상 작동) 전부 검증 완료. 상세 기록은 11_JWT_Authentication_Filter.docx 참고.</w:t>
+            </w:r>
+          </w:p>
+        </w:tc>
+      </w:tr>
+      <w:tr>
+        <w:tc>
+          <w:tcPr>
+            <w:tcW w:type="dxa" w:w="1800"/>
+            <w:shd w:fill="F2F2F2" w:color="auto" w:val="clear"/>
+          </w:tcPr>
+          <w:p>
+            <w:r>
+              <w:rPr>
+                <w:b/>
+                <w:bCs/>
+              </w:rPr>
+              <w:t xml:space="preserve">Files</w:t>
+            </w:r>
+          </w:p>
+        </w:tc>
+        <w:tc>
+          <w:tcPr>
+            <w:tcW w:type="dxa" w:w="7700"/>
+          </w:tcPr>
+          <w:p>
+            <w:r>
+              <w:rPr>
+                <w:b w:val="false"/>
+                <w:bCs w:val="false"/>
+              </w:rPr>
+              <w:t xml:space="preserve">config/JwtAuthenticationFilter.java (new); config/SecurityConfig.java (modified — filter 등록); dto/UserProfileResponse.java (new); controller/UserController.java (new); repository/UserRepository.java (modified — findWithRolesById 추가)</w:t>
+            </w:r>
+          </w:p>
+        </w:tc>
+      </w:tr>
+      <w:tr>
+        <w:tc>
+          <w:tcPr>
+            <w:tcW w:type="dxa" w:w="1800"/>
+            <w:shd w:fill="F2F2F2" w:color="auto" w:val="clear"/>
+          </w:tcPr>
+          <w:p>
+            <w:r>
+              <w:rPr>
+                <w:b/>
+                <w:bCs/>
+              </w:rPr>
+              <w:t xml:space="preserve">Next</w:t>
+            </w:r>
+          </w:p>
+        </w:tc>
+        <w:tc>
+          <w:tcPr>
+            <w:tcW w:type="dxa" w:w="7700"/>
+          </w:tcPr>
+          <w:p>
+            <w:r>
+              <w:rPr>
+                <w:b w:val="false"/>
+                <w:bCs w:val="false"/>
+              </w:rPr>
+              <w:t xml:space="preserve">401 vs 403 응답 통일 여부 결정 (커스텀 AuthenticationEntryPoint 검토). 디버깅용 System.out.println 제거. Logout/Refresh Token 엔드포인트 (05 API Spec §3.3/§3.4) — refresh token 폐기(sessions table 기반 revocation)는 여전히 미구현. 이후 Business/Community 등 보호된 API는 이번 JwtAuthenticationFilter + @AuthenticationPrincipal 패턴을 재사용.</w:t>
             </w:r>
           </w:p>
         </w:tc>

</xml_diff>